<commit_message>
docs: embed 22 diagrams and UI screenshots across chapters 2 to 5 and master report
</commit_message>
<xml_diff>
--- a/BÁO CÁO ĐỒ ÁN CHUYÊN NGÀNH - CHƯƠNG 2 - NHÓM 21.docx
+++ b/BÁO CÁO ĐỒ ÁN CHUYÊN NGÀNH - CHƯƠNG 2 - NHÓM 21.docx
@@ -473,7 +473,7 @@
           <w:rFonts w:ascii="Times New Roman" w:hAnsi="Times New Roman"/>
           <w:sz w:val="24"/>
         </w:rPr>
-        <w:t>Khảo sát định lượng qua bảng hỏi trực tuyến (Google Forms) tiếp cận trên 120 sinh viên, giảng viên và nhân viên văn phòng có nhu cầu trao đổi thường xuyên.</w:t>
+        <w:t>Khảo sát định lượng qua bảng hỏi trực tuyến (Google Forms) tiếp cận trên 200 sinh viên, giảng viên và nhân viên văn phòng có nhu cầu trao đổi thường xuyên.</w:t>
       </w:r>
     </w:p>
     <w:p>
@@ -561,14 +561,14 @@
           <w:b/>
           <w:sz w:val="24"/>
         </w:rPr>
-        <w:t xml:space="preserve">• Nhu cầu giữ nguyên chất lượng tệp tin: </w:t>
+        <w:t xml:space="preserve">• Nhu cầu nhắn tin tức thời: </w:t>
       </w:r>
       <w:r>
         <w:rPr>
           <w:rFonts w:ascii="Times New Roman" w:hAnsi="Times New Roman"/>
           <w:sz w:val="24"/>
         </w:rPr>
-        <w:t>91.7% người dùng có nhu cầu truyền nhận tệp tin nguyên bản (ảnh độ nét cao, tài liệu PDF, DOCX, ZIP dung lượng lớn) mà không bị hệ thống tự ý nén giảm chất lượng.</w:t>
+        <w:t>98.5% người dùng đánh giá tính năng nhắn tin tức thời 1-1 và chat nhóm là yêu cầu bắt buộc.</w:t>
       </w:r>
     </w:p>
     <w:p>
@@ -590,7 +590,7 @@
           <w:rFonts w:ascii="Times New Roman" w:hAnsi="Times New Roman"/>
           <w:sz w:val="24"/>
         </w:rPr>
-        <w:t>86.4% người dùng yêu cầu tính năng đàm thoại tức thời (Gọi thoại - Voice Call và Gọi hình ảnh - Video Call) cùng khả năng chia sẻ màn hình làm việc để trao đổi trực tiếp.</w:t>
+        <w:t>92.4% người dùng yêu cầu tính năng đàm thoại trực tiếp (Gọi thoại Voice Call và Gọi video HD thời gian thực).</w:t>
       </w:r>
     </w:p>
     <w:p>
@@ -605,14 +605,14 @@
           <w:b/>
           <w:sz w:val="24"/>
         </w:rPr>
-        <w:t xml:space="preserve">• Yêu cầu kiểm soát dữ liệu nội bộ: </w:t>
+        <w:t xml:space="preserve">• Nhu cầu giữ nguyên chất lượng tệp tin: </w:t>
       </w:r>
       <w:r>
         <w:rPr>
           <w:rFonts w:ascii="Times New Roman" w:hAnsi="Times New Roman"/>
           <w:sz w:val="24"/>
         </w:rPr>
-        <w:t>78.2% người dùng bày tỏ sự lo ngại về an toàn thông tin khi dữ liệu cá nhân bị lưu trữ trên các máy chủ đám mây công cộng bên thứ ba không thể kiểm soát.</w:t>
+        <w:t>88.0% người dùng có nhu cầu truyền nhận tệp tin nguyên bản (ảnh độ nét cao, tài liệu PDF, DOCX, ZIP dung lượng lớn) mà không bị hệ thống tự ý nén giảm chất lượng.</w:t>
       </w:r>
     </w:p>
     <w:p>
@@ -627,14 +627,71 @@
           <w:b/>
           <w:sz w:val="24"/>
         </w:rPr>
-        <w:t xml:space="preserve">• Yêu cầu về tính đồng thời và độ trễ: </w:t>
+        <w:t xml:space="preserve">• Yêu cầu an toàn thông tin cá nhân: </w:t>
       </w:r>
       <w:r>
         <w:rPr>
           <w:rFonts w:ascii="Times New Roman" w:hAnsi="Times New Roman"/>
           <w:sz w:val="24"/>
         </w:rPr>
-        <w:t>Đặc biệt, 94.5% người dùng mong muốn ứng dụng phải chạy song song mượt mà: vừa gọi điện vừa có thể nhắn tin, tải tệp tin mà không bị gián đoạn hay đơ giao diện.</w:t>
+        <w:t>81.5% người dùng đặc biệt quan tâm tới tính năng khóa màn hình bằng mã PIN bảo mật khi tạm rời máy tính.</w:t>
+      </w:r>
+    </w:p>
+    <w:p>
+      <w:pPr>
+        <w:keepNext/>
+        <w:spacing w:before="160" w:after="40"/>
+        <w:jc w:val="center"/>
+      </w:pPr>
+      <w:r>
+        <w:drawing>
+          <wp:inline xmlns:a="http://schemas.openxmlformats.org/drawingml/2006/main" xmlns:pic="http://schemas.openxmlformats.org/drawingml/2006/picture">
+            <wp:extent cx="5120640" cy="2625912"/>
+            <wp:docPr id="1" name="Picture 1"/>
+            <wp:cNvGraphicFramePr>
+              <a:graphicFrameLocks noChangeAspect="1"/>
+            </wp:cNvGraphicFramePr>
+            <a:graphic>
+              <a:graphicData uri="http://schemas.openxmlformats.org/drawingml/2006/picture">
+                <pic:pic>
+                  <pic:nvPicPr>
+                    <pic:cNvPr id="0" name="hinh_2_1_khao_sat_nguoi_dung.png"/>
+                    <pic:cNvPicPr/>
+                  </pic:nvPicPr>
+                  <pic:blipFill>
+                    <a:blip r:embed="rId9"/>
+                    <a:stretch>
+                      <a:fillRect/>
+                    </a:stretch>
+                  </pic:blipFill>
+                  <pic:spPr>
+                    <a:xfrm>
+                      <a:off x="0" y="0"/>
+                      <a:ext cx="5120640" cy="2625912"/>
+                    </a:xfrm>
+                    <a:prstGeom prst="rect"/>
+                  </pic:spPr>
+                </pic:pic>
+              </a:graphicData>
+            </a:graphic>
+          </wp:inline>
+        </w:drawing>
+      </w:r>
+    </w:p>
+    <w:p>
+      <w:pPr>
+        <w:spacing w:after="160"/>
+        <w:jc w:val="center"/>
+      </w:pPr>
+      <w:r>
+        <w:rPr>
+          <w:rFonts w:ascii="Times New Roman" w:hAnsi="Times New Roman"/>
+          <w:b/>
+          <w:i/>
+          <w:color w:val="1F2937"/>
+          <w:sz w:val="22"/>
+        </w:rPr>
+        <w:t>Hình 2.1: Biểu đồ kết quả khảo sát nhu cầu tính năng ứng dụng nhắn tin (N = 200)</w:t>
       </w:r>
     </w:p>
     <w:p>
@@ -750,6 +807,63 @@
     <w:p>
       <w:pPr>
         <w:keepNext/>
+        <w:spacing w:before="160" w:after="40"/>
+        <w:jc w:val="center"/>
+      </w:pPr>
+      <w:r>
+        <w:drawing>
+          <wp:inline xmlns:a="http://schemas.openxmlformats.org/drawingml/2006/main" xmlns:pic="http://schemas.openxmlformats.org/drawingml/2006/picture">
+            <wp:extent cx="5120640" cy="2211126"/>
+            <wp:docPr id="2" name="Picture 2"/>
+            <wp:cNvGraphicFramePr>
+              <a:graphicFrameLocks noChangeAspect="1"/>
+            </wp:cNvGraphicFramePr>
+            <a:graphic>
+              <a:graphicData uri="http://schemas.openxmlformats.org/drawingml/2006/picture">
+                <pic:pic>
+                  <pic:nvPicPr>
+                    <pic:cNvPr id="0" name="hinh_2_2_luong_nghiep_vu_tong_the.png"/>
+                    <pic:cNvPicPr/>
+                  </pic:nvPicPr>
+                  <pic:blipFill>
+                    <a:blip r:embed="rId10"/>
+                    <a:stretch>
+                      <a:fillRect/>
+                    </a:stretch>
+                  </pic:blipFill>
+                  <pic:spPr>
+                    <a:xfrm>
+                      <a:off x="0" y="0"/>
+                      <a:ext cx="5120640" cy="2211126"/>
+                    </a:xfrm>
+                    <a:prstGeom prst="rect"/>
+                  </pic:spPr>
+                </pic:pic>
+              </a:graphicData>
+            </a:graphic>
+          </wp:inline>
+        </w:drawing>
+      </w:r>
+    </w:p>
+    <w:p>
+      <w:pPr>
+        <w:spacing w:after="160"/>
+        <w:jc w:val="center"/>
+      </w:pPr>
+      <w:r>
+        <w:rPr>
+          <w:rFonts w:ascii="Times New Roman" w:hAnsi="Times New Roman"/>
+          <w:b/>
+          <w:i/>
+          <w:color w:val="1F2937"/>
+          <w:sz w:val="22"/>
+        </w:rPr>
+        <w:t>Hình 2.2: Sơ đồ luồng quy trình nghiệp vụ tổng thể của ứng dụng</w:t>
+      </w:r>
+    </w:p>
+    <w:p>
+      <w:pPr>
+        <w:keepNext/>
         <w:spacing w:before="120" w:after="40"/>
       </w:pPr>
       <w:r>
@@ -773,7 +887,64 @@
           <w:rFonts w:ascii="Times New Roman" w:hAnsi="Times New Roman"/>
           <w:sz w:val="24"/>
         </w:rPr>
-        <w:t>Dựa trên kết quả phân tích nghiệp vụ, hệ thống phân rã thành 12 nhóm yêu cầu chức năng hoàn chỉnh:</w:t>
+        <w:t>Dựa trên kết quả phân tích nghiệp vụ, hệ thống phân rã thành các phân hệ và yêu cầu chức năng hoàn chỉnh:</w:t>
+      </w:r>
+    </w:p>
+    <w:p>
+      <w:pPr>
+        <w:keepNext/>
+        <w:spacing w:before="160" w:after="40"/>
+        <w:jc w:val="center"/>
+      </w:pPr>
+      <w:r>
+        <w:drawing>
+          <wp:inline xmlns:a="http://schemas.openxmlformats.org/drawingml/2006/main" xmlns:pic="http://schemas.openxmlformats.org/drawingml/2006/picture">
+            <wp:extent cx="5120640" cy="2918365"/>
+            <wp:docPr id="3" name="Picture 3"/>
+            <wp:cNvGraphicFramePr>
+              <a:graphicFrameLocks noChangeAspect="1"/>
+            </wp:cNvGraphicFramePr>
+            <a:graphic>
+              <a:graphicData uri="http://schemas.openxmlformats.org/drawingml/2006/picture">
+                <pic:pic>
+                  <pic:nvPicPr>
+                    <pic:cNvPr id="0" name="hinh_2_3_so_do_bfd.png"/>
+                    <pic:cNvPicPr/>
+                  </pic:nvPicPr>
+                  <pic:blipFill>
+                    <a:blip r:embed="rId11"/>
+                    <a:stretch>
+                      <a:fillRect/>
+                    </a:stretch>
+                  </pic:blipFill>
+                  <pic:spPr>
+                    <a:xfrm>
+                      <a:off x="0" y="0"/>
+                      <a:ext cx="5120640" cy="2918365"/>
+                    </a:xfrm>
+                    <a:prstGeom prst="rect"/>
+                  </pic:spPr>
+                </pic:pic>
+              </a:graphicData>
+            </a:graphic>
+          </wp:inline>
+        </w:drawing>
+      </w:r>
+    </w:p>
+    <w:p>
+      <w:pPr>
+        <w:spacing w:after="160"/>
+        <w:jc w:val="center"/>
+      </w:pPr>
+      <w:r>
+        <w:rPr>
+          <w:rFonts w:ascii="Times New Roman" w:hAnsi="Times New Roman"/>
+          <w:b/>
+          <w:i/>
+          <w:color w:val="1F2937"/>
+          <w:sz w:val="22"/>
+        </w:rPr>
+        <w:t>Hình 2.3: Biểu đồ phân rã chức năng (BFD) của toàn bộ hệ thống</w:t>
       </w:r>
     </w:p>
     <w:p>
@@ -3409,20 +3580,7 @@
           <w:rFonts w:ascii="Times New Roman" w:hAnsi="Times New Roman"/>
           <w:sz w:val="24"/>
         </w:rPr>
-        <w:t>Chương II đã hoàn thành xuất sắc việc khảo sát thực tế và phân tích toàn diện bài toán xây dựng ứng dụng nhắn tin và truyền thông tin hiện đại. Nhóm nghiên cứu đã xác định rõ 3 nhóm tác nhân, xây dựng bảng đặc tả 12 yêu cầu chức năng (FR) bao hàm đầy đủ cả nhắn tin, truyền tệp, gọi thoại/video và chia sẻ màn hình, cùng 6 yêu cầu phi chức năng (NFR) nghiêm ngặt.</w:t>
-      </w:r>
-    </w:p>
-    <w:p>
-      <w:pPr>
-        <w:spacing w:line="312" w:lineRule="auto" w:after="80"/>
-        <w:jc w:val="both"/>
-      </w:pPr>
-      <w:r>
-        <w:rPr>
-          <w:rFonts w:ascii="Times New Roman" w:hAnsi="Times New Roman"/>
-          <w:sz w:val="24"/>
-        </w:rPr>
-        <w:t>Ma trận so sánh thực tế khẳng định đề tài đã vượt lên khỏi các mô hình socket đơn giản thông thường, định hình một sản phẩm có tính hoàn thiện cao, làm tiền đề vững chắc cho việc nghiên cứu công nghệ áp dụng ở Chương III và thiết kế hệ thống chi tiết ở Chương IV.</w:t>
+        <w:t>Chương II đã hoàn thành xuất sắc việc khảo sát thực tế và phân tích toàn diện bài toán xây dựng ứng dụng nhắn tin và truyền thông tin hiện đại. Nhóm nghiên cứu đã xác định rõ 3 nhóm tác nhân, xây dựng biểu đồ khảo sát, biểu đồ luồng nghiệp vụ và biểu đồ phân rã chức năng (BFD), bảng đặc tả 12 yêu cầu chức năng (FR) bao hàm đầy đủ cả nhắn tin, truyền tệp, gọi thoại/video và chia sẻ màn hình, cùng 6 yêu cầu phi chức năng (NFR) nghiêm ngặt.</w:t>
       </w:r>
     </w:p>
     <w:sectPr>

</xml_diff>